<commit_message>
Typo revisions and inclusions of scoping themes on climate change
</commit_message>
<xml_diff>
--- a/ClimOO material/competency questions/Competency Questions (CQs).docx
+++ b/ClimOO material/competency questions/Competency Questions (CQs).docx
@@ -23,17 +23,7 @@
           <w:szCs w:val="32"/>
           <w:lang w:val="en-US"/>
         </w:rPr>
-        <w:t>Competency Questions</w:t>
-      </w:r>
-      <w:r>
-        <w:rPr>
-          <w:rFonts w:ascii="Calibri" w:hAnsi="Calibri" w:cs="Calibri"/>
-          <w:color w:val="000000" w:themeColor="text1"/>
-          <w:sz w:val="32"/>
-          <w:szCs w:val="32"/>
-          <w:lang w:val="en-US"/>
-        </w:rPr>
-        <w:t xml:space="preserve"> (CQs)</w:t>
+        <w:t>Competency Questions (CQs)</w:t>
       </w:r>
     </w:p>
     <w:p>
@@ -257,7 +247,7 @@
           <w:szCs w:val="22"/>
           <w:lang w:val="en-US"/>
         </w:rPr>
-        <w:t>What distinguishes a plastic object from a plastic debris?</w:t>
+        <w:t>What distinguishes a plastic object from plastic debris?</w:t>
       </w:r>
     </w:p>
     <w:p>

</xml_diff>